<commit_message>
docs(tabs): config guides for narrative, What if, delivery modes and module tabs; island paths resolve against the config
</commit_message>
<xml_diff>
--- a/docs/HOW_TO_SET_UP_A_TURAS_PROJECT.docx
+++ b/docs/HOW_TO_SET_UP_A_TURAS_PROJECT.docx
@@ -46,7 +46,7 @@
           <w:sz w:val="20"/>
           <w:szCs w:val="20"/>
         </w:rPr>
-        <w:t xml:space="preserve">The Research LampPost  ·  14 August 2026</w:t>
+        <w:t xml:space="preserve">The Research LampPost  ·  14 August 2026, updated 24 September 2026</w:t>
       </w:r>
     </w:p>
     <w:p>
@@ -765,6 +765,168 @@
                 <w:sz w:val="20"/>
                 <w:szCs w:val="20"/>
               </w:rPr>
+              <w:t xml:space="preserve">&lt;Project&gt; Narrative.docx</w:t>
+            </w:r>
+          </w:p>
+        </w:tc>
+        <w:tc>
+          <w:tcPr>
+            <w:tcW w:type="dxa" w:w="4326"/>
+            <w:shd w:fill="FFFFFF" w:color="auto" w:val="clear"/>
+            <w:tcMar>
+              <w:top w:type="dxa" w:w="80"/>
+              <w:left w:type="dxa" w:w="120"/>
+              <w:bottom w:type="dxa" w:w="80"/>
+              <w:right w:type="dxa" w:w="120"/>
+            </w:tcMar>
+          </w:tcPr>
+          <w:p>
+            <w:pPr>
+              <w:spacing w:after="0" w:line="260"/>
+            </w:pPr>
+            <w:r>
+              <w:rPr>
+                <w:rFonts w:ascii="Calibri" w:cs="Calibri" w:eastAsia="Calibri" w:hAnsi="Calibri"/>
+                <w:sz w:val="22"/>
+                <w:szCs w:val="22"/>
+              </w:rPr>
+              <w:t xml:space="preserve">The report's Background and Executive summary, written in Word. Named in narrative_file.</w:t>
+            </w:r>
+          </w:p>
+        </w:tc>
+        <w:tc>
+          <w:tcPr>
+            <w:tcW w:type="dxa" w:w="1000"/>
+            <w:shd w:fill="FFFFFF" w:color="auto" w:val="clear"/>
+            <w:tcMar>
+              <w:top w:type="dxa" w:w="80"/>
+              <w:left w:type="dxa" w:w="120"/>
+              <w:bottom w:type="dxa" w:w="80"/>
+              <w:right w:type="dxa" w:w="120"/>
+            </w:tcMar>
+          </w:tcPr>
+          <w:p>
+            <w:pPr>
+              <w:spacing w:after="0" w:line="260"/>
+            </w:pPr>
+            <w:r>
+              <w:rPr>
+                <w:rFonts w:ascii="Calibri" w:cs="Calibri" w:eastAsia="Calibri" w:hAnsi="Calibri"/>
+                <w:sz w:val="22"/>
+                <w:szCs w:val="22"/>
+              </w:rPr>
+              <w:t xml:space="preserve">6</w:t>
+            </w:r>
+          </w:p>
+        </w:tc>
+      </w:tr>
+      <w:tr>
+        <w:trPr>
+          <w:cantSplit/>
+        </w:trPr>
+        <w:tc>
+          <w:tcPr>
+            <w:tcW w:type="dxa" w:w="3700"/>
+            <w:shd w:fill="FFFFFF" w:color="auto" w:val="clear"/>
+            <w:tcMar>
+              <w:top w:type="dxa" w:w="80"/>
+              <w:left w:type="dxa" w:w="120"/>
+              <w:bottom w:type="dxa" w:w="80"/>
+              <w:right w:type="dxa" w:w="120"/>
+            </w:tcMar>
+          </w:tcPr>
+          <w:p>
+            <w:pPr>
+              <w:spacing w:after="0" w:line="260"/>
+            </w:pPr>
+            <w:r>
+              <w:rPr>
+                <w:rFonts w:ascii="Consolas" w:cs="Consolas" w:eastAsia="Consolas" w:hAnsi="Consolas"/>
+                <w:color w:val="1F4E5F"/>
+                <w:sz w:val="20"/>
+                <w:szCs w:val="20"/>
+              </w:rPr>
+              <w:t xml:space="preserve">*_cj / _md / _pr / _kd / _cd / _whatif_island.json</w:t>
+            </w:r>
+          </w:p>
+        </w:tc>
+        <w:tc>
+          <w:tcPr>
+            <w:tcW w:type="dxa" w:w="4326"/>
+            <w:shd w:fill="FFFFFF" w:color="auto" w:val="clear"/>
+            <w:tcMar>
+              <w:top w:type="dxa" w:w="80"/>
+              <w:left w:type="dxa" w:w="120"/>
+              <w:bottom w:type="dxa" w:w="80"/>
+              <w:right w:type="dxa" w:w="120"/>
+            </w:tcMar>
+          </w:tcPr>
+          <w:p>
+            <w:pPr>
+              <w:spacing w:after="0" w:line="260"/>
+            </w:pPr>
+            <w:r>
+              <w:rPr>
+                <w:rFonts w:ascii="Calibri" w:cs="Calibri" w:eastAsia="Calibri" w:hAnsi="Calibri"/>
+                <w:sz w:val="22"/>
+                <w:szCs w:val="22"/>
+              </w:rPr>
+              <w:t xml:space="preserve">Another module's results, one file per module, for its own report tab. Named in Settings.</w:t>
+            </w:r>
+          </w:p>
+        </w:tc>
+        <w:tc>
+          <w:tcPr>
+            <w:tcW w:type="dxa" w:w="1000"/>
+            <w:shd w:fill="FFFFFF" w:color="auto" w:val="clear"/>
+            <w:tcMar>
+              <w:top w:type="dxa" w:w="80"/>
+              <w:left w:type="dxa" w:w="120"/>
+              <w:bottom w:type="dxa" w:w="80"/>
+              <w:right w:type="dxa" w:w="120"/>
+            </w:tcMar>
+          </w:tcPr>
+          <w:p>
+            <w:pPr>
+              <w:spacing w:after="0" w:line="260"/>
+            </w:pPr>
+            <w:r>
+              <w:rPr>
+                <w:rFonts w:ascii="Calibri" w:cs="Calibri" w:eastAsia="Calibri" w:hAnsi="Calibri"/>
+                <w:sz w:val="22"/>
+                <w:szCs w:val="22"/>
+              </w:rPr>
+              <w:t xml:space="preserve">6</w:t>
+            </w:r>
+          </w:p>
+        </w:tc>
+      </w:tr>
+      <w:tr>
+        <w:trPr>
+          <w:cantSplit/>
+        </w:trPr>
+        <w:tc>
+          <w:tcPr>
+            <w:tcW w:type="dxa" w:w="3700"/>
+            <w:shd w:fill="FFFFFF" w:color="auto" w:val="clear"/>
+            <w:tcMar>
+              <w:top w:type="dxa" w:w="80"/>
+              <w:left w:type="dxa" w:w="120"/>
+              <w:bottom w:type="dxa" w:w="80"/>
+              <w:right w:type="dxa" w:w="120"/>
+            </w:tcMar>
+          </w:tcPr>
+          <w:p>
+            <w:pPr>
+              <w:spacing w:after="0" w:line="260"/>
+            </w:pPr>
+            <w:r>
+              <w:rPr>
+                <w:rFonts w:ascii="Consolas" w:cs="Consolas" w:eastAsia="Consolas" w:hAnsi="Consolas"/>
+                <w:color w:val="1F4E5F"/>
+                <w:sz w:val="20"/>
+                <w:szCs w:val="20"/>
+              </w:rPr>
               <w:t xml:space="preserve">&lt;config name&gt;_reader_keys.json</w:t>
             </w:r>
           </w:p>
@@ -3117,7 +3279,41 @@
           <w:sz w:val="22"/>
           <w:szCs w:val="22"/>
         </w:rPr>
-        <w:t xml:space="preserve"> holds the report's written narrative, and the AddedSlides sheet holds study exhibits. Both belong to stage 6.</w:t>
+        <w:t xml:space="preserve"> holds the report's written narrative, unless a Word document named in </w:t>
+      </w:r>
+      <w:r>
+        <w:rPr>
+          <w:rFonts w:ascii="Consolas" w:cs="Consolas" w:eastAsia="Consolas" w:hAnsi="Consolas"/>
+          <w:color w:val="1F4E5F"/>
+          <w:sz w:val="20"/>
+          <w:szCs w:val="20"/>
+        </w:rPr>
+        <w:t xml:space="preserve">narrative_file</w:t>
+      </w:r>
+      <w:r>
+        <w:rPr>
+          <w:rFonts w:ascii="Calibri" w:cs="Calibri" w:eastAsia="Calibri" w:hAnsi="Calibri"/>
+          <w:sz w:val="22"/>
+          <w:szCs w:val="22"/>
+        </w:rPr>
+        <w:t xml:space="preserve"> does, and the AddedSlides sheet holds study exhibits. Settings can also bring in results from another Turas module as extra report tabs (</w:t>
+      </w:r>
+      <w:r>
+        <w:rPr>
+          <w:rFonts w:ascii="Consolas" w:cs="Consolas" w:eastAsia="Consolas" w:hAnsi="Consolas"/>
+          <w:color w:val="1F4E5F"/>
+          <w:sz w:val="20"/>
+          <w:szCs w:val="20"/>
+        </w:rPr>
+        <w:t xml:space="preserve">conjoint_island</w:t>
+      </w:r>
+      <w:r>
+        <w:rPr>
+          <w:rFonts w:ascii="Calibri" w:cs="Calibri" w:eastAsia="Calibri" w:hAnsi="Calibri"/>
+          <w:sz w:val="22"/>
+          <w:szCs w:val="22"/>
+        </w:rPr>
+        <w:t xml:space="preserve"> and its siblings). All three belong to stage 6.</w:t>
       </w:r>
     </w:p>
     <w:p>
@@ -9962,24 +10158,15 @@
           <w:sz w:val="22"/>
           <w:szCs w:val="22"/>
         </w:rPr>
-        <w:t xml:space="preserve">Tracking and the confidential ship cannot both be on  </w:t>
-      </w:r>
-      <w:r>
-        <w:rPr>
-          <w:rFonts w:ascii="Consolas" w:cs="Consolas" w:eastAsia="Consolas" w:hAnsi="Consolas"/>
-          <w:color w:val="1F4E5F"/>
-          <w:sz w:val="20"/>
-          <w:szCs w:val="20"/>
-        </w:rPr>
-        <w:t xml:space="preserve">html_report_v2_microdata = FALSE</w:t>
-      </w:r>
-      <w:r>
-        <w:rPr>
-          <w:rFonts w:ascii="Calibri" w:cs="Calibri" w:eastAsia="Calibri" w:hAnsi="Calibri"/>
-          <w:sz w:val="22"/>
-          <w:szCs w:val="22"/>
-        </w:rPr>
-        <w:t xml:space="preserve"> switches tracking off entirely. The live wave needs its microdata to produce its own sidecar, so a confidential build writes no </w:t>
+        <w:t xml:space="preserve">A client-safe build keeps its Tracking tab  </w:t>
+      </w:r>
+      <w:r>
+        <w:rPr>
+          <w:rFonts w:ascii="Calibri" w:cs="Calibri" w:eastAsia="Calibri" w:hAnsi="Calibri"/>
+          <w:sz w:val="22"/>
+          <w:szCs w:val="22"/>
+        </w:rPr>
+        <w:t xml:space="preserve">It has no respondent records to build this wave from, so the current wave is built from the published figures instead, and the console says so. The trend and the history match your own copy. What it does not do is write a </w:t>
       </w:r>
       <w:r>
         <w:rPr>
@@ -9996,7 +10183,7 @@
           <w:sz w:val="22"/>
           <w:szCs w:val="22"/>
         </w:rPr>
-        <w:t xml:space="preserve"> and shows no Tracking tab. The console says so explicitly when it happens.</w:t>
+        <w:t xml:space="preserve">, so keep the one your full (records) build wrote. That file is this wave's contribution to next year's history.</w:t>
       </w:r>
     </w:p>
     <w:p>
@@ -10545,6 +10732,63 @@
           <w:sz w:val="22"/>
           <w:szCs w:val="22"/>
         </w:rPr>
+        <w:t xml:space="preserve">From a Word document.</w:t>
+      </w:r>
+      <w:r>
+        <w:rPr>
+          <w:rFonts w:ascii="Calibri" w:cs="Calibri" w:eastAsia="Calibri" w:hAnsi="Calibri"/>
+          <w:sz w:val="22"/>
+          <w:szCs w:val="22"/>
+        </w:rPr>
+        <w:t xml:space="preserve"> Set </w:t>
+      </w:r>
+      <w:r>
+        <w:rPr>
+          <w:rFonts w:ascii="Consolas" w:cs="Consolas" w:eastAsia="Consolas" w:hAnsi="Consolas"/>
+          <w:color w:val="1F4E5F"/>
+          <w:sz w:val="20"/>
+          <w:szCs w:val="20"/>
+        </w:rPr>
+        <w:t xml:space="preserve">narrative_file</w:t>
+      </w:r>
+      <w:r>
+        <w:rPr>
+          <w:rFonts w:ascii="Calibri" w:cs="Calibri" w:eastAsia="Calibri" w:hAnsi="Calibri"/>
+          <w:sz w:val="22"/>
+          <w:szCs w:val="22"/>
+        </w:rPr>
+        <w:t xml:space="preserve"> in Settings to a .docx beside the config (the path is relative to the config). Each Heading 1 starts a screen on the Report tab, so Background, Executive summary and any other summary screens are written in Word, with headings, lists, bold, quotes, pictures and simple tables. Each screen can be pinned to the Story. A saved copy's cover opens with the screen whose title starts "Executive summary", or the first screen when none does. A named file that is missing refuses the run. How to write the document: </w:t>
+      </w:r>
+      <w:r>
+        <w:rPr>
+          <w:rFonts w:ascii="Consolas" w:cs="Consolas" w:eastAsia="Consolas" w:hAnsi="Consolas"/>
+          <w:color w:val="1F4E5F"/>
+          <w:sz w:val="20"/>
+          <w:szCs w:val="20"/>
+        </w:rPr>
+        <w:t xml:space="preserve">modules/tabs/docs/NARRATIVE_WORD_GUIDE.md</w:t>
+      </w:r>
+      <w:r>
+        <w:rPr>
+          <w:rFonts w:ascii="Calibri" w:cs="Calibri" w:eastAsia="Calibri" w:hAnsi="Calibri"/>
+          <w:sz w:val="22"/>
+          <w:szCs w:val="22"/>
+        </w:rPr>
+        <w:t xml:space="preserve">.</w:t>
+      </w:r>
+    </w:p>
+    <w:p>
+      <w:pPr>
+        <w:spacing w:after="140" w:line="276"/>
+      </w:pPr>
+      <w:r>
+        <w:rPr>
+          <w:rFonts w:ascii="Calibri" w:cs="Calibri" w:eastAsia="Calibri" w:hAnsi="Calibri"/>
+          <w:b/>
+          <w:bCs/>
+          <w:sz w:val="22"/>
+          <w:szCs w:val="22"/>
+        </w:rPr>
         <w:t xml:space="preserve">From the config — the Comments sheet.</w:t>
       </w:r>
       <w:r>
@@ -10553,7 +10797,7 @@
           <w:sz w:val="22"/>
           <w:szCs w:val="22"/>
         </w:rPr>
-        <w:t xml:space="preserve"> Three reserved rows carry narrative: </w:t>
+        <w:t xml:space="preserve"> Three reserved rows carry narrative (the first two only when narrative_file is blank): </w:t>
       </w:r>
       <w:r>
         <w:rPr>
@@ -10714,6 +10958,262 @@
           <w:sz w:val="24"/>
           <w:szCs w:val="24"/>
         </w:rPr>
+        <w:t xml:space="preserve">Adding other modules to the report</w:t>
+      </w:r>
+    </w:p>
+    <w:p>
+      <w:pPr>
+        <w:spacing w:after="140" w:line="276"/>
+      </w:pPr>
+      <w:r>
+        <w:rPr>
+          <w:rFonts w:ascii="Calibri" w:cs="Calibri" w:eastAsia="Calibri" w:hAnsi="Calibri"/>
+          <w:b/>
+          <w:bCs/>
+          <w:sz w:val="22"/>
+          <w:szCs w:val="22"/>
+        </w:rPr>
+        <w:t xml:space="preserve">A tab of its own.</w:t>
+      </w:r>
+      <w:r>
+        <w:rPr>
+          <w:rFonts w:ascii="Calibri" w:cs="Calibri" w:eastAsia="Calibri" w:hAnsi="Calibri"/>
+          <w:sz w:val="22"/>
+          <w:szCs w:val="22"/>
+        </w:rPr>
+        <w:t xml:space="preserve"> Conjoint, MaxDiff, Pricing, Key drivers, Categorical drivers and What if each write a small contribution file when they run. Name that file in the matching Settings key (</w:t>
+      </w:r>
+      <w:r>
+        <w:rPr>
+          <w:rFonts w:ascii="Consolas" w:cs="Consolas" w:eastAsia="Consolas" w:hAnsi="Consolas"/>
+          <w:color w:val="1F4E5F"/>
+          <w:sz w:val="20"/>
+          <w:szCs w:val="20"/>
+        </w:rPr>
+        <w:t xml:space="preserve">conjoint_island</w:t>
+      </w:r>
+      <w:r>
+        <w:rPr>
+          <w:rFonts w:ascii="Calibri" w:cs="Calibri" w:eastAsia="Calibri" w:hAnsi="Calibri"/>
+          <w:sz w:val="22"/>
+          <w:szCs w:val="22"/>
+        </w:rPr>
+        <w:t xml:space="preserve">, </w:t>
+      </w:r>
+      <w:r>
+        <w:rPr>
+          <w:rFonts w:ascii="Consolas" w:cs="Consolas" w:eastAsia="Consolas" w:hAnsi="Consolas"/>
+          <w:color w:val="1F4E5F"/>
+          <w:sz w:val="20"/>
+          <w:szCs w:val="20"/>
+        </w:rPr>
+        <w:t xml:space="preserve">maxdiff_island</w:t>
+      </w:r>
+      <w:r>
+        <w:rPr>
+          <w:rFonts w:ascii="Calibri" w:cs="Calibri" w:eastAsia="Calibri" w:hAnsi="Calibri"/>
+          <w:sz w:val="22"/>
+          <w:szCs w:val="22"/>
+        </w:rPr>
+        <w:t xml:space="preserve">, </w:t>
+      </w:r>
+      <w:r>
+        <w:rPr>
+          <w:rFonts w:ascii="Consolas" w:cs="Consolas" w:eastAsia="Consolas" w:hAnsi="Consolas"/>
+          <w:color w:val="1F4E5F"/>
+          <w:sz w:val="20"/>
+          <w:szCs w:val="20"/>
+        </w:rPr>
+        <w:t xml:space="preserve">pricing_island</w:t>
+      </w:r>
+      <w:r>
+        <w:rPr>
+          <w:rFonts w:ascii="Calibri" w:cs="Calibri" w:eastAsia="Calibri" w:hAnsi="Calibri"/>
+          <w:sz w:val="22"/>
+          <w:szCs w:val="22"/>
+        </w:rPr>
+        <w:t xml:space="preserve">, </w:t>
+      </w:r>
+      <w:r>
+        <w:rPr>
+          <w:rFonts w:ascii="Consolas" w:cs="Consolas" w:eastAsia="Consolas" w:hAnsi="Consolas"/>
+          <w:color w:val="1F4E5F"/>
+          <w:sz w:val="20"/>
+          <w:szCs w:val="20"/>
+        </w:rPr>
+        <w:t xml:space="preserve">keydriver_island</w:t>
+      </w:r>
+      <w:r>
+        <w:rPr>
+          <w:rFonts w:ascii="Calibri" w:cs="Calibri" w:eastAsia="Calibri" w:hAnsi="Calibri"/>
+          <w:sz w:val="22"/>
+          <w:szCs w:val="22"/>
+        </w:rPr>
+        <w:t xml:space="preserve">, </w:t>
+      </w:r>
+      <w:r>
+        <w:rPr>
+          <w:rFonts w:ascii="Consolas" w:cs="Consolas" w:eastAsia="Consolas" w:hAnsi="Consolas"/>
+          <w:color w:val="1F4E5F"/>
+          <w:sz w:val="20"/>
+          <w:szCs w:val="20"/>
+        </w:rPr>
+        <w:t xml:space="preserve">catdriver_island</w:t>
+      </w:r>
+      <w:r>
+        <w:rPr>
+          <w:rFonts w:ascii="Calibri" w:cs="Calibri" w:eastAsia="Calibri" w:hAnsi="Calibri"/>
+          <w:sz w:val="22"/>
+          <w:szCs w:val="22"/>
+        </w:rPr>
+        <w:t xml:space="preserve">, </w:t>
+      </w:r>
+      <w:r>
+        <w:rPr>
+          <w:rFonts w:ascii="Consolas" w:cs="Consolas" w:eastAsia="Consolas" w:hAnsi="Consolas"/>
+          <w:color w:val="1F4E5F"/>
+          <w:sz w:val="20"/>
+          <w:szCs w:val="20"/>
+        </w:rPr>
+        <w:t xml:space="preserve">whatif_island</w:t>
+      </w:r>
+      <w:r>
+        <w:rPr>
+          <w:rFonts w:ascii="Calibri" w:cs="Calibri" w:eastAsia="Calibri" w:hAnsi="Calibri"/>
+          <w:sz w:val="22"/>
+          <w:szCs w:val="22"/>
+        </w:rPr>
+        <w:t xml:space="preserve">) and rebuild: the report gains that module's tab. A relative path is read from the config's folder. Catdriver writes its file only when its own config sets </w:t>
+      </w:r>
+      <w:r>
+        <w:rPr>
+          <w:rFonts w:ascii="Consolas" w:cs="Consolas" w:eastAsia="Consolas" w:hAnsi="Consolas"/>
+          <w:color w:val="1F4E5F"/>
+          <w:sz w:val="20"/>
+          <w:szCs w:val="20"/>
+        </w:rPr>
+        <w:t xml:space="preserve">v2_island = TRUE</w:t>
+      </w:r>
+      <w:r>
+        <w:rPr>
+          <w:rFonts w:ascii="Calibri" w:cs="Calibri" w:eastAsia="Calibri" w:hAnsi="Calibri"/>
+          <w:sz w:val="22"/>
+          <w:szCs w:val="22"/>
+        </w:rPr>
+        <w:t xml:space="preserve">. A wrong path does not stop the run. The console prints a warning and the tab is simply missing, so check the tab bar and the console.</w:t>
+      </w:r>
+    </w:p>
+    <w:p>
+      <w:pPr>
+        <w:spacing w:after="140" w:line="276"/>
+      </w:pPr>
+      <w:r>
+        <w:rPr>
+          <w:rFonts w:ascii="Calibri" w:cs="Calibri" w:eastAsia="Calibri" w:hAnsi="Calibri"/>
+          <w:b/>
+          <w:bCs/>
+          <w:sz w:val="22"/>
+          <w:szCs w:val="22"/>
+        </w:rPr>
+        <w:t xml:space="preserve">What if follows the delivery mode.</w:t>
+      </w:r>
+      <w:r>
+        <w:rPr>
+          <w:rFonts w:ascii="Calibri" w:cs="Calibri" w:eastAsia="Calibri" w:hAnsi="Calibri"/>
+          <w:sz w:val="22"/>
+          <w:szCs w:val="22"/>
+        </w:rPr>
+        <w:t xml:space="preserve"> A full report gets the live version that follows the filter bar; a client-safe report gets results for published groups only. Its file holds respondent IDs, so it stays in the project and never goes to a client. The other five tabs show the same thing in every build, weighted by their own module's settings, so set their weights to match the tabs config.</w:t>
+      </w:r>
+    </w:p>
+    <w:p>
+      <w:pPr>
+        <w:spacing w:after="140" w:line="276"/>
+      </w:pPr>
+      <w:r>
+        <w:rPr>
+          <w:rFonts w:ascii="Calibri" w:cs="Calibri" w:eastAsia="Calibri" w:hAnsi="Calibri"/>
+          <w:b/>
+          <w:bCs/>
+          <w:sz w:val="22"/>
+          <w:szCs w:val="22"/>
+        </w:rPr>
+        <w:t xml:space="preserve">As crosstab questions.</w:t>
+      </w:r>
+      <w:r>
+        <w:rPr>
+          <w:rFonts w:ascii="Calibri" w:cs="Calibri" w:eastAsia="Calibri" w:hAnsi="Calibri"/>
+          <w:sz w:val="22"/>
+          <w:szCs w:val="22"/>
+        </w:rPr>
+        <w:t xml:space="preserve"> Segment (</w:t>
+      </w:r>
+      <w:r>
+        <w:rPr>
+          <w:rFonts w:ascii="Consolas" w:cs="Consolas" w:eastAsia="Consolas" w:hAnsi="Consolas"/>
+          <w:color w:val="1F4E5F"/>
+          <w:sz w:val="20"/>
+          <w:szCs w:val="20"/>
+        </w:rPr>
+        <w:t xml:space="preserve">tabs_export = Y</w:t>
+      </w:r>
+      <w:r>
+        <w:rPr>
+          <w:rFonts w:ascii="Calibri" w:cs="Calibri" w:eastAsia="Calibri" w:hAnsi="Calibri"/>
+          <w:sz w:val="22"/>
+          <w:szCs w:val="22"/>
+        </w:rPr>
+        <w:t xml:space="preserve">) adds a segment banner. Conjoint, MaxDiff and Pricing (</w:t>
+      </w:r>
+      <w:r>
+        <w:rPr>
+          <w:rFonts w:ascii="Consolas" w:cs="Consolas" w:eastAsia="Consolas" w:hAnsi="Consolas"/>
+          <w:color w:val="1F4E5F"/>
+          <w:sz w:val="20"/>
+          <w:szCs w:val="20"/>
+        </w:rPr>
+        <w:t xml:space="preserve">generate_tabs_export</w:t>
+      </w:r>
+      <w:r>
+        <w:rPr>
+          <w:rFonts w:ascii="Calibri" w:cs="Calibri" w:eastAsia="Calibri" w:hAnsi="Calibri"/>
+          <w:sz w:val="22"/>
+          <w:szCs w:val="22"/>
+        </w:rPr>
+        <w:t xml:space="preserve">) add per-respondent importance, shares or price acceptance as ordinary questions you can cut by any banner. Each writes a workbook with the data columns and the exact rows to paste into the structure and the Selection sheet. Deeper detail: </w:t>
+      </w:r>
+      <w:r>
+        <w:rPr>
+          <w:rFonts w:ascii="Consolas" w:cs="Consolas" w:eastAsia="Consolas" w:hAnsi="Consolas"/>
+          <w:color w:val="1F4E5F"/>
+          <w:sz w:val="20"/>
+          <w:szCs w:val="20"/>
+        </w:rPr>
+        <w:t xml:space="preserve">modules/tabs/docs/MODULE_TABS_GUIDE.md</w:t>
+      </w:r>
+      <w:r>
+        <w:rPr>
+          <w:rFonts w:ascii="Calibri" w:cs="Calibri" w:eastAsia="Calibri" w:hAnsi="Calibri"/>
+          <w:sz w:val="22"/>
+          <w:szCs w:val="22"/>
+        </w:rPr>
+        <w:t xml:space="preserve">.</w:t>
+      </w:r>
+    </w:p>
+    <w:p>
+      <w:pPr>
+        <w:pStyle w:val="Heading2"/>
+        <w:spacing w:after="100" w:before="280"/>
+      </w:pPr>
+      <w:r>
+        <w:rPr>
+          <w:rFonts w:ascii="Calibri" w:cs="Calibri" w:eastAsia="Calibri" w:hAnsi="Calibri"/>
+          <w:b/>
+          <w:bCs/>
+          <w:color w:val="323367"/>
+          <w:sz w:val="24"/>
+          <w:szCs w:val="24"/>
+        </w:rPr>
         <w:t xml:space="preserve">Building the file you actually send</w:t>
       </w:r>
     </w:p>
@@ -10807,15 +11307,128 @@
           <w:sz w:val="22"/>
           <w:szCs w:val="22"/>
         </w:rPr>
-        <w:t xml:space="preserve">If the k-gate is a promise, ship the confidential build.</w:t>
-      </w:r>
-      <w:r>
-        <w:rPr>
-          <w:rFonts w:ascii="Calibri" w:cs="Calibri" w:eastAsia="Calibri" w:hAnsi="Calibri"/>
-          <w:sz w:val="22"/>
-          <w:szCs w:val="22"/>
-        </w:rPr>
-        <w:t xml:space="preserve"> Set </w:t>
+        <w:t xml:space="preserve">Choose who the file is for.</w:t>
+      </w:r>
+      <w:r>
+        <w:rPr>
+          <w:rFonts w:ascii="Calibri" w:cs="Calibri" w:eastAsia="Calibri" w:hAnsi="Calibri"/>
+          <w:sz w:val="22"/>
+          <w:szCs w:val="22"/>
+        </w:rPr>
+        <w:t xml:space="preserve"> The tabs GUI asks "Who is this file for?" on every build. Full report carries de-identified respondent records, so every view works: for you, or for a client who has been told. Client safe, interactive carries no respondent records; the live filter, custom banners, Differences and Group overview still work on the declared variables, and any cut below </w:t>
+      </w:r>
+      <w:r>
+        <w:rPr>
+          <w:rFonts w:ascii="Consolas" w:cs="Consolas" w:eastAsia="Consolas" w:hAnsi="Consolas"/>
+          <w:color w:val="1F4E5F"/>
+          <w:sz w:val="20"/>
+          <w:szCs w:val="20"/>
+        </w:rPr>
+        <w:t xml:space="preserve">min_reporting_base</w:t>
+      </w:r>
+      <w:r>
+        <w:rPr>
+          <w:rFonts w:ascii="Calibri" w:cs="Calibri" w:eastAsia="Calibri" w:hAnsi="Calibri"/>
+          <w:sz w:val="22"/>
+          <w:szCs w:val="22"/>
+        </w:rPr>
+        <w:t xml:space="preserve"> is withheld. Client safe, frozen is published tables, dashboard, tracking and comments, with no live filtering.</w:t>
+      </w:r>
+    </w:p>
+    <w:p>
+      <w:pPr>
+        <w:pStyle w:val="ListParagraph"/>
+        <w:numPr>
+          <w:ilvl w:val="0"/>
+          <w:numId w:val="8"/>
+        </w:numPr>
+        <w:spacing w:after="80" w:line="276"/>
+      </w:pPr>
+      <w:r>
+        <w:rPr>
+          <w:rFonts w:ascii="Calibri" w:cs="Calibri" w:eastAsia="Calibri" w:hAnsi="Calibri"/>
+          <w:b/>
+          <w:bCs/>
+          <w:sz w:val="22"/>
+          <w:szCs w:val="22"/>
+        </w:rPr>
+        <w:t xml:space="preserve">If the k-gate is a promise, send a client-safe build.</w:t>
+      </w:r>
+      <w:r>
+        <w:rPr>
+          <w:rFonts w:ascii="Calibri" w:cs="Calibri" w:eastAsia="Calibri" w:hAnsi="Calibri"/>
+          <w:sz w:val="22"/>
+          <w:szCs w:val="22"/>
+        </w:rPr>
+        <w:t xml:space="preserve"> With respondent records in the file, the withheld numbers and the per-comment demographics are reconstructable from the page source, whatever the screen shows. The build prints a boxed disclosure warning whenever </w:t>
+      </w:r>
+      <w:r>
+        <w:rPr>
+          <w:rFonts w:ascii="Consolas" w:cs="Consolas" w:eastAsia="Consolas" w:hAnsi="Consolas"/>
+          <w:color w:val="1F4E5F"/>
+          <w:sz w:val="20"/>
+          <w:szCs w:val="20"/>
+        </w:rPr>
+        <w:t xml:space="preserve">min_reporting_base</w:t>
+      </w:r>
+      <w:r>
+        <w:rPr>
+          <w:rFonts w:ascii="Calibri" w:cs="Calibri" w:eastAsia="Calibri" w:hAnsi="Calibri"/>
+          <w:sz w:val="22"/>
+          <w:szCs w:val="22"/>
+        </w:rPr>
+        <w:t xml:space="preserve"> is above 1 and the records still ship, so you cannot send the wrong copy unwarned. The config's </w:t>
+      </w:r>
+      <w:r>
+        <w:rPr>
+          <w:rFonts w:ascii="Consolas" w:cs="Consolas" w:eastAsia="Consolas" w:hAnsi="Consolas"/>
+          <w:color w:val="1F4E5F"/>
+          <w:sz w:val="20"/>
+          <w:szCs w:val="20"/>
+        </w:rPr>
+        <w:t xml:space="preserve">html_report_v2_interactivity</w:t>
+      </w:r>
+      <w:r>
+        <w:rPr>
+          <w:rFonts w:ascii="Calibri" w:cs="Calibri" w:eastAsia="Calibri" w:hAnsi="Calibri"/>
+          <w:sz w:val="22"/>
+          <w:szCs w:val="22"/>
+        </w:rPr>
+        <w:t xml:space="preserve"> (records, cube or none) sets what the project normally ships, and the GUI choice can only add protection to it, never take it away. A cube needs </w:t>
+      </w:r>
+      <w:r>
+        <w:rPr>
+          <w:rFonts w:ascii="Consolas" w:cs="Consolas" w:eastAsia="Consolas" w:hAnsi="Consolas"/>
+          <w:color w:val="1F4E5F"/>
+          <w:sz w:val="20"/>
+          <w:szCs w:val="20"/>
+        </w:rPr>
+        <w:t xml:space="preserve">min_reporting_base</w:t>
+      </w:r>
+      <w:r>
+        <w:rPr>
+          <w:rFonts w:ascii="Calibri" w:cs="Calibri" w:eastAsia="Calibri" w:hAnsi="Calibri"/>
+          <w:sz w:val="22"/>
+          <w:szCs w:val="22"/>
+        </w:rPr>
+        <w:t xml:space="preserve"> above 1. For a cube, list any extra questions the client will want to cut by in </w:t>
+      </w:r>
+      <w:r>
+        <w:rPr>
+          <w:rFonts w:ascii="Consolas" w:cs="Consolas" w:eastAsia="Consolas" w:hAnsi="Consolas"/>
+          <w:color w:val="1F4E5F"/>
+          <w:sz w:val="20"/>
+          <w:szCs w:val="20"/>
+        </w:rPr>
+        <w:t xml:space="preserve">html_report_v2_filter_vars</w:t>
+      </w:r>
+      <w:r>
+        <w:rPr>
+          <w:rFonts w:ascii="Calibri" w:cs="Calibri" w:eastAsia="Calibri" w:hAnsi="Calibri"/>
+          <w:sz w:val="22"/>
+          <w:szCs w:val="22"/>
+        </w:rPr>
+        <w:t xml:space="preserve">. The older </w:t>
       </w:r>
       <w:r>
         <w:rPr>
@@ -10832,24 +11445,7 @@
           <w:sz w:val="22"/>
           <w:szCs w:val="22"/>
         </w:rPr>
-        <w:t xml:space="preserve">. With the microdata island present, the withheld numbers and the per-comment demographics are reconstructable from the page source, whatever the screen shows. The build prints a boxed disclosure warning whenever </w:t>
-      </w:r>
-      <w:r>
-        <w:rPr>
-          <w:rFonts w:ascii="Consolas" w:cs="Consolas" w:eastAsia="Consolas" w:hAnsi="Consolas"/>
-          <w:color w:val="1F4E5F"/>
-          <w:sz w:val="20"/>
-          <w:szCs w:val="20"/>
-        </w:rPr>
-        <w:t xml:space="preserve">min_reporting_base</w:t>
-      </w:r>
-      <w:r>
-        <w:rPr>
-          <w:rFonts w:ascii="Calibri" w:cs="Calibri" w:eastAsia="Calibri" w:hAnsi="Calibri"/>
-          <w:sz w:val="22"/>
-          <w:szCs w:val="22"/>
-        </w:rPr>
-        <w:t xml:space="preserve"> is above 1 and the island still ships, so you cannot send the wrong copy unwarned. The usual setup is two configs: your working one keeps microdata on for full interactivity, the client one turns it off.</w:t>
+        <w:t xml:space="preserve"> still means frozen; leave it blank on new configs.</w:t>
       </w:r>
     </w:p>
     <w:p>

</xml_diff>